<commit_message>
Updating docs and polyanya
</commit_message>
<xml_diff>
--- a/docs/Units.docx
+++ b/docs/Units.docx
@@ -132,7 +132,7 @@
             <w:fldChar w:fldCharType="begin"/>
           </w:r>
           <w:r>
-            <w:instrText xml:space="preserve"> HYPERLINK \l _Toc29455 </w:instrText>
+            <w:instrText xml:space="preserve"> HYPERLINK \l _Toc13538 </w:instrText>
           </w:r>
           <w:r>
             <w:fldChar w:fldCharType="separate"/>
@@ -151,7 +151,7 @@
             <w:fldChar w:fldCharType="begin"/>
           </w:r>
           <w:r>
-            <w:instrText xml:space="preserve"> PAGEREF _Toc29455 \h </w:instrText>
+            <w:instrText xml:space="preserve"> PAGEREF _Toc13538 \h </w:instrText>
           </w:r>
           <w:r>
             <w:fldChar w:fldCharType="separate"/>
@@ -177,7 +177,7 @@
             <w:fldChar w:fldCharType="begin"/>
           </w:r>
           <w:r>
-            <w:instrText xml:space="preserve"> HYPERLINK \l _Toc13499 </w:instrText>
+            <w:instrText xml:space="preserve"> HYPERLINK \l _Toc2328 </w:instrText>
           </w:r>
           <w:r>
             <w:fldChar w:fldCharType="separate"/>
@@ -196,7 +196,7 @@
             <w:fldChar w:fldCharType="begin"/>
           </w:r>
           <w:r>
-            <w:instrText xml:space="preserve"> PAGEREF _Toc13499 \h </w:instrText>
+            <w:instrText xml:space="preserve"> PAGEREF _Toc2328 \h </w:instrText>
           </w:r>
           <w:r>
             <w:fldChar w:fldCharType="separate"/>
@@ -222,7 +222,7 @@
             <w:fldChar w:fldCharType="begin"/>
           </w:r>
           <w:r>
-            <w:instrText xml:space="preserve"> HYPERLINK \l _Toc11665 </w:instrText>
+            <w:instrText xml:space="preserve"> HYPERLINK \l _Toc12409 </w:instrText>
           </w:r>
           <w:r>
             <w:fldChar w:fldCharType="separate"/>
@@ -241,13 +241,13 @@
             <w:fldChar w:fldCharType="begin"/>
           </w:r>
           <w:r>
-            <w:instrText xml:space="preserve"> PAGEREF _Toc11665 \h </w:instrText>
+            <w:instrText xml:space="preserve"> PAGEREF _Toc12409 \h </w:instrText>
           </w:r>
           <w:r>
             <w:fldChar w:fldCharType="separate"/>
           </w:r>
           <w:r>
-            <w:t>4</w:t>
+            <w:t>5</w:t>
           </w:r>
           <w:r>
             <w:fldChar w:fldCharType="end"/>
@@ -267,7 +267,7 @@
             <w:fldChar w:fldCharType="begin"/>
           </w:r>
           <w:r>
-            <w:instrText xml:space="preserve"> HYPERLINK \l _Toc23025 </w:instrText>
+            <w:instrText xml:space="preserve"> HYPERLINK \l _Toc26809 </w:instrText>
           </w:r>
           <w:r>
             <w:fldChar w:fldCharType="separate"/>
@@ -286,142 +286,7 @@
             <w:fldChar w:fldCharType="begin"/>
           </w:r>
           <w:r>
-            <w:instrText xml:space="preserve"> PAGEREF _Toc23025 \h </w:instrText>
-          </w:r>
-          <w:r>
-            <w:fldChar w:fldCharType="separate"/>
-          </w:r>
-          <w:r>
-            <w:t>5</w:t>
-          </w:r>
-          <w:r>
-            <w:fldChar w:fldCharType="end"/>
-          </w:r>
-          <w:r>
-            <w:fldChar w:fldCharType="end"/>
-          </w:r>
-        </w:p>
-        <w:p>
-          <w:pPr>
-            <w:pStyle w:val="144"/>
-            <w:tabs>
-              <w:tab w:val="right" w:leader="dot" w:pos="8306"/>
-            </w:tabs>
-          </w:pPr>
-          <w:r>
-            <w:fldChar w:fldCharType="begin"/>
-          </w:r>
-          <w:r>
-            <w:instrText xml:space="preserve"> HYPERLINK \l _Toc24278 </w:instrText>
-          </w:r>
-          <w:r>
-            <w:fldChar w:fldCharType="separate"/>
-          </w:r>
-          <w:r>
-            <w:rPr>
-              <w:rFonts w:hint="default"/>
-              <w:lang w:val="fr-FR"/>
-            </w:rPr>
-            <w:t>a) Naëmu</w:t>
-          </w:r>
-          <w:r>
-            <w:tab/>
-          </w:r>
-          <w:r>
-            <w:fldChar w:fldCharType="begin"/>
-          </w:r>
-          <w:r>
-            <w:instrText xml:space="preserve"> PAGEREF _Toc24278 \h </w:instrText>
-          </w:r>
-          <w:r>
-            <w:fldChar w:fldCharType="separate"/>
-          </w:r>
-          <w:r>
-            <w:t>5</w:t>
-          </w:r>
-          <w:r>
-            <w:fldChar w:fldCharType="end"/>
-          </w:r>
-          <w:r>
-            <w:fldChar w:fldCharType="end"/>
-          </w:r>
-        </w:p>
-        <w:p>
-          <w:pPr>
-            <w:pStyle w:val="144"/>
-            <w:tabs>
-              <w:tab w:val="right" w:leader="dot" w:pos="8306"/>
-            </w:tabs>
-          </w:pPr>
-          <w:r>
-            <w:fldChar w:fldCharType="begin"/>
-          </w:r>
-          <w:r>
-            <w:instrText xml:space="preserve"> HYPERLINK \l _Toc1547 </w:instrText>
-          </w:r>
-          <w:r>
-            <w:fldChar w:fldCharType="separate"/>
-          </w:r>
-          <w:r>
-            <w:rPr>
-              <w:rFonts w:hint="default"/>
-              <w:lang w:val="fr-FR"/>
-            </w:rPr>
-            <w:t>b) Alfan</w:t>
-          </w:r>
-          <w:r>
-            <w:tab/>
-          </w:r>
-          <w:r>
-            <w:fldChar w:fldCharType="begin"/>
-          </w:r>
-          <w:r>
-            <w:instrText xml:space="preserve"> PAGEREF _Toc1547 \h </w:instrText>
-          </w:r>
-          <w:r>
-            <w:fldChar w:fldCharType="separate"/>
-          </w:r>
-          <w:r>
-            <w:t>6</w:t>
-          </w:r>
-          <w:r>
-            <w:fldChar w:fldCharType="end"/>
-          </w:r>
-          <w:r>
-            <w:fldChar w:fldCharType="end"/>
-          </w:r>
-        </w:p>
-        <w:p>
-          <w:pPr>
-            <w:pStyle w:val="143"/>
-            <w:tabs>
-              <w:tab w:val="right" w:leader="dot" w:pos="8306"/>
-            </w:tabs>
-          </w:pPr>
-          <w:r>
-            <w:fldChar w:fldCharType="begin"/>
-          </w:r>
-          <w:r>
-            <w:instrText xml:space="preserve"> HYPERLINK \l _Toc13041 </w:instrText>
-          </w:r>
-          <w:r>
-            <w:fldChar w:fldCharType="separate"/>
-          </w:r>
-          <w:r>
-            <w:rPr>
-              <w:rFonts w:hint="default"/>
-              <w:lang w:val="fr-FR"/>
-            </w:rPr>
-            <w:t>III. Sprats</w:t>
-          </w:r>
-          <w:r>
-            <w:tab/>
-          </w:r>
-          <w:r>
-            <w:fldChar w:fldCharType="begin"/>
-          </w:r>
-          <w:r>
-            <w:instrText xml:space="preserve"> PAGEREF _Toc13041 \h </w:instrText>
+            <w:instrText xml:space="preserve"> PAGEREF _Toc26809 \h </w:instrText>
           </w:r>
           <w:r>
             <w:fldChar w:fldCharType="separate"/>
@@ -447,7 +312,7 @@
             <w:fldChar w:fldCharType="begin"/>
           </w:r>
           <w:r>
-            <w:instrText xml:space="preserve"> HYPERLINK \l _Toc14364 </w:instrText>
+            <w:instrText xml:space="preserve"> HYPERLINK \l _Toc9597 </w:instrText>
           </w:r>
           <w:r>
             <w:fldChar w:fldCharType="separate"/>
@@ -457,7 +322,7 @@
               <w:rFonts w:hint="default"/>
               <w:lang w:val="fr-FR"/>
             </w:rPr>
-            <w:t>a) Expansionists</w:t>
+            <w:t>a) Naëmu</w:t>
           </w:r>
           <w:r>
             <w:tab/>
@@ -466,7 +331,7 @@
             <w:fldChar w:fldCharType="begin"/>
           </w:r>
           <w:r>
-            <w:instrText xml:space="preserve"> PAGEREF _Toc14364 \h </w:instrText>
+            <w:instrText xml:space="preserve"> PAGEREF _Toc9597 \h </w:instrText>
           </w:r>
           <w:r>
             <w:fldChar w:fldCharType="separate"/>
@@ -492,7 +357,7 @@
             <w:fldChar w:fldCharType="begin"/>
           </w:r>
           <w:r>
-            <w:instrText xml:space="preserve"> HYPERLINK \l _Toc27314 </w:instrText>
+            <w:instrText xml:space="preserve"> HYPERLINK \l _Toc11417 </w:instrText>
           </w:r>
           <w:r>
             <w:fldChar w:fldCharType="separate"/>
@@ -502,7 +367,7 @@
               <w:rFonts w:hint="default"/>
               <w:lang w:val="fr-FR"/>
             </w:rPr>
-            <w:t>b) Collaborators</w:t>
+            <w:t>b) Alfan</w:t>
           </w:r>
           <w:r>
             <w:tab/>
@@ -511,7 +376,7 @@
             <w:fldChar w:fldCharType="begin"/>
           </w:r>
           <w:r>
-            <w:instrText xml:space="preserve"> PAGEREF _Toc27314 \h </w:instrText>
+            <w:instrText xml:space="preserve"> PAGEREF _Toc11417 \h </w:instrText>
           </w:r>
           <w:r>
             <w:fldChar w:fldCharType="separate"/>
@@ -537,7 +402,7 @@
             <w:fldChar w:fldCharType="begin"/>
           </w:r>
           <w:r>
-            <w:instrText xml:space="preserve"> HYPERLINK \l _Toc7069 </w:instrText>
+            <w:instrText xml:space="preserve"> HYPERLINK \l _Toc21820 </w:instrText>
           </w:r>
           <w:r>
             <w:fldChar w:fldCharType="separate"/>
@@ -547,7 +412,7 @@
               <w:rFonts w:hint="default"/>
               <w:lang w:val="fr-FR"/>
             </w:rPr>
-            <w:t>IV. Alvearium</w:t>
+            <w:t>III. Sprats</w:t>
           </w:r>
           <w:r>
             <w:tab/>
@@ -556,7 +421,7 @@
             <w:fldChar w:fldCharType="begin"/>
           </w:r>
           <w:r>
-            <w:instrText xml:space="preserve"> PAGEREF _Toc7069 \h </w:instrText>
+            <w:instrText xml:space="preserve"> PAGEREF _Toc21820 \h </w:instrText>
           </w:r>
           <w:r>
             <w:fldChar w:fldCharType="separate"/>
@@ -582,7 +447,7 @@
             <w:fldChar w:fldCharType="begin"/>
           </w:r>
           <w:r>
-            <w:instrText xml:space="preserve"> HYPERLINK \l _Toc16906 </w:instrText>
+            <w:instrText xml:space="preserve"> HYPERLINK \l _Toc32474 </w:instrText>
           </w:r>
           <w:r>
             <w:fldChar w:fldCharType="separate"/>
@@ -592,7 +457,7 @@
               <w:rFonts w:hint="default"/>
               <w:lang w:val="fr-FR"/>
             </w:rPr>
-            <w:t>a) Alvearium</w:t>
+            <w:t>a) Expansionists</w:t>
           </w:r>
           <w:r>
             <w:tab/>
@@ -601,7 +466,7 @@
             <w:fldChar w:fldCharType="begin"/>
           </w:r>
           <w:r>
-            <w:instrText xml:space="preserve"> PAGEREF _Toc16906 \h </w:instrText>
+            <w:instrText xml:space="preserve"> PAGEREF _Toc32474 \h </w:instrText>
           </w:r>
           <w:r>
             <w:fldChar w:fldCharType="separate"/>
@@ -627,7 +492,7 @@
             <w:fldChar w:fldCharType="begin"/>
           </w:r>
           <w:r>
-            <w:instrText xml:space="preserve"> HYPERLINK \l _Toc10663 </w:instrText>
+            <w:instrText xml:space="preserve"> HYPERLINK \l _Toc16159 </w:instrText>
           </w:r>
           <w:r>
             <w:fldChar w:fldCharType="separate"/>
@@ -637,7 +502,7 @@
               <w:rFonts w:hint="default"/>
               <w:lang w:val="fr-FR"/>
             </w:rPr>
-            <w:t>b) The Cutaways</w:t>
+            <w:t>b) Collaborators</w:t>
           </w:r>
           <w:r>
             <w:tab/>
@@ -646,7 +511,7 @@
             <w:fldChar w:fldCharType="begin"/>
           </w:r>
           <w:r>
-            <w:instrText xml:space="preserve"> PAGEREF _Toc10663 \h </w:instrText>
+            <w:instrText xml:space="preserve"> PAGEREF _Toc16159 \h </w:instrText>
           </w:r>
           <w:r>
             <w:fldChar w:fldCharType="separate"/>
@@ -672,7 +537,7 @@
             <w:fldChar w:fldCharType="begin"/>
           </w:r>
           <w:r>
-            <w:instrText xml:space="preserve"> HYPERLINK \l _Toc3797 </w:instrText>
+            <w:instrText xml:space="preserve"> HYPERLINK \l _Toc4070 </w:instrText>
           </w:r>
           <w:r>
             <w:fldChar w:fldCharType="separate"/>
@@ -682,7 +547,7 @@
               <w:rFonts w:hint="default"/>
               <w:lang w:val="fr-FR"/>
             </w:rPr>
-            <w:t>V. The Network</w:t>
+            <w:t>IV. Alvearium</w:t>
           </w:r>
           <w:r>
             <w:tab/>
@@ -691,7 +556,7 @@
             <w:fldChar w:fldCharType="begin"/>
           </w:r>
           <w:r>
-            <w:instrText xml:space="preserve"> PAGEREF _Toc3797 \h </w:instrText>
+            <w:instrText xml:space="preserve"> PAGEREF _Toc4070 \h </w:instrText>
           </w:r>
           <w:r>
             <w:fldChar w:fldCharType="separate"/>
@@ -717,7 +582,7 @@
             <w:fldChar w:fldCharType="begin"/>
           </w:r>
           <w:r>
-            <w:instrText xml:space="preserve"> HYPERLINK \l _Toc17707 </w:instrText>
+            <w:instrText xml:space="preserve"> HYPERLINK \l _Toc19963 </w:instrText>
           </w:r>
           <w:r>
             <w:fldChar w:fldCharType="separate"/>
@@ -727,7 +592,7 @@
               <w:rFonts w:hint="default"/>
               <w:lang w:val="fr-FR"/>
             </w:rPr>
-            <w:t>a) The Core</w:t>
+            <w:t>a) Alvearium</w:t>
           </w:r>
           <w:r>
             <w:tab/>
@@ -736,7 +601,7 @@
             <w:fldChar w:fldCharType="begin"/>
           </w:r>
           <w:r>
-            <w:instrText xml:space="preserve"> PAGEREF _Toc17707 \h </w:instrText>
+            <w:instrText xml:space="preserve"> PAGEREF _Toc19963 \h </w:instrText>
           </w:r>
           <w:r>
             <w:fldChar w:fldCharType="separate"/>
@@ -762,7 +627,142 @@
             <w:fldChar w:fldCharType="begin"/>
           </w:r>
           <w:r>
-            <w:instrText xml:space="preserve"> HYPERLINK \l _Toc699 </w:instrText>
+            <w:instrText xml:space="preserve"> HYPERLINK \l _Toc4849 </w:instrText>
+          </w:r>
+          <w:r>
+            <w:fldChar w:fldCharType="separate"/>
+          </w:r>
+          <w:r>
+            <w:rPr>
+              <w:rFonts w:hint="default"/>
+              <w:lang w:val="fr-FR"/>
+            </w:rPr>
+            <w:t>b) The Cutaways</w:t>
+          </w:r>
+          <w:r>
+            <w:tab/>
+          </w:r>
+          <w:r>
+            <w:fldChar w:fldCharType="begin"/>
+          </w:r>
+          <w:r>
+            <w:instrText xml:space="preserve"> PAGEREF _Toc4849 \h </w:instrText>
+          </w:r>
+          <w:r>
+            <w:fldChar w:fldCharType="separate"/>
+          </w:r>
+          <w:r>
+            <w:t>12</w:t>
+          </w:r>
+          <w:r>
+            <w:fldChar w:fldCharType="end"/>
+          </w:r>
+          <w:r>
+            <w:fldChar w:fldCharType="end"/>
+          </w:r>
+        </w:p>
+        <w:p>
+          <w:pPr>
+            <w:pStyle w:val="143"/>
+            <w:tabs>
+              <w:tab w:val="right" w:leader="dot" w:pos="8306"/>
+            </w:tabs>
+          </w:pPr>
+          <w:r>
+            <w:fldChar w:fldCharType="begin"/>
+          </w:r>
+          <w:r>
+            <w:instrText xml:space="preserve"> HYPERLINK \l _Toc21794 </w:instrText>
+          </w:r>
+          <w:r>
+            <w:fldChar w:fldCharType="separate"/>
+          </w:r>
+          <w:r>
+            <w:rPr>
+              <w:rFonts w:hint="default"/>
+              <w:lang w:val="fr-FR"/>
+            </w:rPr>
+            <w:t>V. The Network</w:t>
+          </w:r>
+          <w:r>
+            <w:tab/>
+          </w:r>
+          <w:r>
+            <w:fldChar w:fldCharType="begin"/>
+          </w:r>
+          <w:r>
+            <w:instrText xml:space="preserve"> PAGEREF _Toc21794 \h </w:instrText>
+          </w:r>
+          <w:r>
+            <w:fldChar w:fldCharType="separate"/>
+          </w:r>
+          <w:r>
+            <w:t>13</w:t>
+          </w:r>
+          <w:r>
+            <w:fldChar w:fldCharType="end"/>
+          </w:r>
+          <w:r>
+            <w:fldChar w:fldCharType="end"/>
+          </w:r>
+        </w:p>
+        <w:p>
+          <w:pPr>
+            <w:pStyle w:val="144"/>
+            <w:tabs>
+              <w:tab w:val="right" w:leader="dot" w:pos="8306"/>
+            </w:tabs>
+          </w:pPr>
+          <w:r>
+            <w:fldChar w:fldCharType="begin"/>
+          </w:r>
+          <w:r>
+            <w:instrText xml:space="preserve"> HYPERLINK \l _Toc28482 </w:instrText>
+          </w:r>
+          <w:r>
+            <w:fldChar w:fldCharType="separate"/>
+          </w:r>
+          <w:r>
+            <w:rPr>
+              <w:rFonts w:hint="default"/>
+              <w:lang w:val="fr-FR"/>
+            </w:rPr>
+            <w:t>a) The Core</w:t>
+          </w:r>
+          <w:r>
+            <w:tab/>
+          </w:r>
+          <w:r>
+            <w:fldChar w:fldCharType="begin"/>
+          </w:r>
+          <w:r>
+            <w:instrText xml:space="preserve"> PAGEREF _Toc28482 \h </w:instrText>
+          </w:r>
+          <w:r>
+            <w:fldChar w:fldCharType="separate"/>
+          </w:r>
+          <w:r>
+            <w:t>13</w:t>
+          </w:r>
+          <w:r>
+            <w:fldChar w:fldCharType="end"/>
+          </w:r>
+          <w:r>
+            <w:fldChar w:fldCharType="end"/>
+          </w:r>
+        </w:p>
+        <w:p>
+          <w:pPr>
+            <w:pStyle w:val="144"/>
+            <w:tabs>
+              <w:tab w:val="right" w:leader="dot" w:pos="8306"/>
+            </w:tabs>
+          </w:pPr>
+          <w:r>
+            <w:fldChar w:fldCharType="begin"/>
+          </w:r>
+          <w:r>
+            <w:instrText xml:space="preserve"> HYPERLINK \l _Toc760 </w:instrText>
           </w:r>
           <w:r>
             <w:fldChar w:fldCharType="separate"/>
@@ -781,13 +781,13 @@
             <w:fldChar w:fldCharType="begin"/>
           </w:r>
           <w:r>
-            <w:instrText xml:space="preserve"> PAGEREF _Toc699 \h </w:instrText>
+            <w:instrText xml:space="preserve"> PAGEREF _Toc760 \h </w:instrText>
           </w:r>
           <w:r>
             <w:fldChar w:fldCharType="separate"/>
           </w:r>
           <w:r>
-            <w:t>12</w:t>
+            <w:t>14</w:t>
           </w:r>
           <w:r>
             <w:fldChar w:fldCharType="end"/>
@@ -841,7 +841,7 @@
           <w:lang w:val="fr-FR"/>
         </w:rPr>
       </w:pPr>
-      <w:bookmarkStart w:id="0" w:name="_Toc29455"/>
+      <w:bookmarkStart w:id="0" w:name="_Toc13538"/>
       <w:r>
         <w:rPr>
           <w:rFonts w:hint="default"/>
@@ -864,7 +864,7 @@
           <w:lang w:val="fr-FR"/>
         </w:rPr>
       </w:pPr>
-      <w:bookmarkStart w:id="1" w:name="_Toc13499"/>
+      <w:bookmarkStart w:id="1" w:name="_Toc2328"/>
       <w:r>
         <w:rPr>
           <w:rFonts w:hint="default"/>
@@ -1554,7 +1554,7 @@
           <w:lang w:val="fr-FR"/>
         </w:rPr>
       </w:pPr>
-      <w:bookmarkStart w:id="2" w:name="_Toc11665"/>
+      <w:bookmarkStart w:id="2" w:name="_Toc12409"/>
       <w:r>
         <w:rPr>
           <w:rFonts w:hint="default"/>
@@ -1580,6 +1580,8 @@
         </w:rPr>
         <w:t>Infantry</w:t>
       </w:r>
+      <w:bookmarkStart w:id="15" w:name="_GoBack"/>
+      <w:bookmarkEnd w:id="15"/>
     </w:p>
     <w:p>
       <w:pPr>
@@ -1623,7 +1625,7 @@
           <w:rFonts w:hint="default"/>
           <w:lang w:val="fr-FR"/>
         </w:rPr>
-        <w:t>- Commando Squad</w:t>
+        <w:t>- Elite Resistance Squad</w:t>
       </w:r>
     </w:p>
     <w:p>
@@ -1648,8 +1650,6 @@
           <w:lang w:val="fr-FR"/>
         </w:rPr>
       </w:pPr>
-      <w:bookmarkStart w:id="15" w:name="_GoBack"/>
-      <w:bookmarkEnd w:id="15"/>
     </w:p>
     <w:p>
       <w:pPr>
@@ -1666,6 +1666,36 @@
           <w:lang w:val="fr-FR"/>
         </w:rPr>
         <w:t>Vehicles</w:t>
+      </w:r>
+    </w:p>
+    <w:p>
+      <w:pPr>
+        <w:rPr>
+          <w:rFonts w:hint="default"/>
+          <w:lang w:val="fr-FR"/>
+        </w:rPr>
+      </w:pPr>
+      <w:r>
+        <w:rPr>
+          <w:rFonts w:hint="default"/>
+          <w:lang w:val="fr-FR"/>
+        </w:rPr>
+        <w:t>- Pickup Truck</w:t>
+      </w:r>
+    </w:p>
+    <w:p>
+      <w:pPr>
+        <w:rPr>
+          <w:rFonts w:hint="default"/>
+          <w:lang w:val="fr-FR"/>
+        </w:rPr>
+      </w:pPr>
+      <w:r>
+        <w:rPr>
+          <w:rFonts w:hint="default"/>
+          <w:lang w:val="fr-FR"/>
+        </w:rPr>
+        <w:t xml:space="preserve">- </w:t>
       </w:r>
     </w:p>
     <w:p>
@@ -1832,7 +1862,7 @@
           <w:lang w:val="fr-FR"/>
         </w:rPr>
       </w:pPr>
-      <w:bookmarkStart w:id="3" w:name="_Toc23025"/>
+      <w:bookmarkStart w:id="3" w:name="_Toc26809"/>
       <w:r>
         <w:rPr>
           <w:rFonts w:hint="default"/>
@@ -1855,7 +1885,7 @@
           <w:lang w:val="fr-FR"/>
         </w:rPr>
       </w:pPr>
-      <w:bookmarkStart w:id="4" w:name="_Toc24278"/>
+      <w:bookmarkStart w:id="4" w:name="_Toc9597"/>
       <w:r>
         <w:rPr>
           <w:rFonts w:hint="default"/>
@@ -2056,7 +2086,7 @@
           <w:lang w:val="fr-FR"/>
         </w:rPr>
       </w:pPr>
-      <w:bookmarkStart w:id="5" w:name="_Toc1547"/>
+      <w:bookmarkStart w:id="5" w:name="_Toc11417"/>
       <w:r>
         <w:rPr>
           <w:rFonts w:hint="default"/>
@@ -2272,7 +2302,7 @@
           <w:lang w:val="fr-FR"/>
         </w:rPr>
       </w:pPr>
-      <w:bookmarkStart w:id="6" w:name="_Toc13041"/>
+      <w:bookmarkStart w:id="6" w:name="_Toc21820"/>
       <w:r>
         <w:rPr>
           <w:rFonts w:hint="default"/>
@@ -2295,7 +2325,7 @@
           <w:lang w:val="fr-FR"/>
         </w:rPr>
       </w:pPr>
-      <w:bookmarkStart w:id="7" w:name="_Toc14364"/>
+      <w:bookmarkStart w:id="7" w:name="_Toc32474"/>
       <w:r>
         <w:rPr>
           <w:rFonts w:hint="default"/>
@@ -2496,7 +2526,7 @@
           <w:lang w:val="fr-FR"/>
         </w:rPr>
       </w:pPr>
-      <w:bookmarkStart w:id="8" w:name="_Toc27314"/>
+      <w:bookmarkStart w:id="8" w:name="_Toc16159"/>
       <w:r>
         <w:rPr>
           <w:rFonts w:hint="default"/>
@@ -2712,7 +2742,7 @@
           <w:lang w:val="fr-FR"/>
         </w:rPr>
       </w:pPr>
-      <w:bookmarkStart w:id="9" w:name="_Toc7069"/>
+      <w:bookmarkStart w:id="9" w:name="_Toc4070"/>
       <w:r>
         <w:rPr>
           <w:rFonts w:hint="default"/>
@@ -2735,7 +2765,7 @@
           <w:lang w:val="fr-FR"/>
         </w:rPr>
       </w:pPr>
-      <w:bookmarkStart w:id="10" w:name="_Toc16906"/>
+      <w:bookmarkStart w:id="10" w:name="_Toc19963"/>
       <w:r>
         <w:rPr>
           <w:rFonts w:hint="default"/>
@@ -2936,7 +2966,7 @@
           <w:lang w:val="fr-FR"/>
         </w:rPr>
       </w:pPr>
-      <w:bookmarkStart w:id="11" w:name="_Toc10663"/>
+      <w:bookmarkStart w:id="11" w:name="_Toc4849"/>
       <w:r>
         <w:rPr>
           <w:rFonts w:hint="default"/>
@@ -3152,7 +3182,7 @@
           <w:lang w:val="fr-FR"/>
         </w:rPr>
       </w:pPr>
-      <w:bookmarkStart w:id="12" w:name="_Toc3797"/>
+      <w:bookmarkStart w:id="12" w:name="_Toc21794"/>
       <w:r>
         <w:rPr>
           <w:rFonts w:hint="default"/>
@@ -3175,7 +3205,7 @@
           <w:lang w:val="fr-FR"/>
         </w:rPr>
       </w:pPr>
-      <w:bookmarkStart w:id="13" w:name="_Toc17707"/>
+      <w:bookmarkStart w:id="13" w:name="_Toc28482"/>
       <w:r>
         <w:rPr>
           <w:rFonts w:hint="default"/>
@@ -3376,7 +3406,7 @@
           <w:lang w:val="fr-FR"/>
         </w:rPr>
       </w:pPr>
-      <w:bookmarkStart w:id="14" w:name="_Toc699"/>
+      <w:bookmarkStart w:id="14" w:name="_Toc760"/>
       <w:r>
         <w:rPr>
           <w:rFonts w:hint="default"/>
@@ -4070,10 +4100,10 @@
     <w:lsdException w:qFormat="1" w:unhideWhenUsed="0" w:uiPriority="0" w:semiHidden="0" w:name="Table Classic 1"/>
     <w:lsdException w:qFormat="1" w:unhideWhenUsed="0" w:uiPriority="0" w:semiHidden="0" w:name="Table Classic 2"/>
     <w:lsdException w:qFormat="1" w:unhideWhenUsed="0" w:uiPriority="0" w:semiHidden="0" w:name="Table Classic 3"/>
-    <w:lsdException w:unhideWhenUsed="0" w:uiPriority="0" w:semiHidden="0" w:name="Table Classic 4"/>
+    <w:lsdException w:qFormat="1" w:unhideWhenUsed="0" w:uiPriority="0" w:semiHidden="0" w:name="Table Classic 4"/>
     <w:lsdException w:qFormat="1" w:unhideWhenUsed="0" w:uiPriority="0" w:semiHidden="0" w:name="Table Colorful 1"/>
-    <w:lsdException w:unhideWhenUsed="0" w:uiPriority="0" w:semiHidden="0" w:name="Table Colorful 2"/>
-    <w:lsdException w:unhideWhenUsed="0" w:uiPriority="0" w:semiHidden="0" w:name="Table Colorful 3"/>
+    <w:lsdException w:qFormat="1" w:unhideWhenUsed="0" w:uiPriority="0" w:semiHidden="0" w:name="Table Colorful 2"/>
+    <w:lsdException w:qFormat="1" w:unhideWhenUsed="0" w:uiPriority="0" w:semiHidden="0" w:name="Table Colorful 3"/>
     <w:lsdException w:qFormat="1" w:unhideWhenUsed="0" w:uiPriority="0" w:semiHidden="0" w:name="Table Columns 1"/>
     <w:lsdException w:qFormat="1" w:unhideWhenUsed="0" w:uiPriority="0" w:semiHidden="0" w:name="Table Columns 2"/>
     <w:lsdException w:unhideWhenUsed="0" w:uiPriority="0" w:semiHidden="0" w:name="Table Columns 3"/>
@@ -4084,7 +4114,7 @@
     <w:lsdException w:qFormat="1" w:unhideWhenUsed="0" w:uiPriority="0" w:semiHidden="0" w:name="Table Grid 3"/>
     <w:lsdException w:qFormat="1" w:unhideWhenUsed="0" w:uiPriority="0" w:semiHidden="0" w:name="Table Grid 4"/>
     <w:lsdException w:unhideWhenUsed="0" w:uiPriority="0" w:semiHidden="0" w:name="Table Grid 5"/>
-    <w:lsdException w:unhideWhenUsed="0" w:uiPriority="0" w:semiHidden="0" w:name="Table Grid 6"/>
+    <w:lsdException w:qFormat="1" w:unhideWhenUsed="0" w:uiPriority="0" w:semiHidden="0" w:name="Table Grid 6"/>
     <w:lsdException w:qFormat="1" w:unhideWhenUsed="0" w:uiPriority="0" w:semiHidden="0" w:name="Table Grid 7"/>
     <w:lsdException w:qFormat="1" w:unhideWhenUsed="0" w:uiPriority="0" w:semiHidden="0" w:name="Table Grid 8"/>
     <w:lsdException w:qFormat="1" w:unhideWhenUsed="0" w:uiPriority="0" w:semiHidden="0" w:name="Table List 1"/>
@@ -4095,7 +4125,7 @@
     <w:lsdException w:qFormat="1" w:unhideWhenUsed="0" w:uiPriority="0" w:semiHidden="0" w:name="Table List 6"/>
     <w:lsdException w:unhideWhenUsed="0" w:uiPriority="0" w:semiHidden="0" w:name="Table List 7"/>
     <w:lsdException w:qFormat="1" w:unhideWhenUsed="0" w:uiPriority="0" w:semiHidden="0" w:name="Table List 8"/>
-    <w:lsdException w:unhideWhenUsed="0" w:uiPriority="0" w:semiHidden="0" w:name="Table 3D effects 1"/>
+    <w:lsdException w:qFormat="1" w:unhideWhenUsed="0" w:uiPriority="0" w:semiHidden="0" w:name="Table 3D effects 1"/>
     <w:lsdException w:qFormat="1" w:unhideWhenUsed="0" w:uiPriority="0" w:semiHidden="0" w:name="Table 3D effects 2"/>
     <w:lsdException w:qFormat="1" w:unhideWhenUsed="0" w:uiPriority="0" w:semiHidden="0" w:name="Table 3D effects 3"/>
     <w:lsdException w:unhideWhenUsed="0" w:uiPriority="0" w:semiHidden="0" w:name="Table Contemporary"/>
@@ -4121,8 +4151,8 @@
     <w:lsdException w:qFormat="1" w:unhideWhenUsed="0" w:uiPriority="69" w:semiHidden="0" w:name="Medium Grid 3"/>
     <w:lsdException w:qFormat="1" w:unhideWhenUsed="0" w:uiPriority="70" w:semiHidden="0" w:name="Dark List"/>
     <w:lsdException w:qFormat="1" w:unhideWhenUsed="0" w:uiPriority="71" w:semiHidden="0" w:name="Colorful Shading"/>
-    <w:lsdException w:unhideWhenUsed="0" w:uiPriority="72" w:semiHidden="0" w:name="Colorful List"/>
-    <w:lsdException w:unhideWhenUsed="0" w:uiPriority="73" w:semiHidden="0" w:name="Colorful Grid"/>
+    <w:lsdException w:qFormat="1" w:unhideWhenUsed="0" w:uiPriority="72" w:semiHidden="0" w:name="Colorful List"/>
+    <w:lsdException w:qFormat="1" w:unhideWhenUsed="0" w:uiPriority="73" w:semiHidden="0" w:name="Colorful Grid"/>
     <w:lsdException w:qFormat="1" w:unhideWhenUsed="0" w:uiPriority="60" w:semiHidden="0" w:name="Light Shading Accent 1"/>
     <w:lsdException w:qFormat="1" w:unhideWhenUsed="0" w:uiPriority="61" w:semiHidden="0" w:name="Light List Accent 1"/>
     <w:lsdException w:qFormat="1" w:unhideWhenUsed="0" w:uiPriority="62" w:semiHidden="0" w:name="Light Grid Accent 1"/>
@@ -4143,7 +4173,7 @@
     <w:lsdException w:qFormat="1" w:unhideWhenUsed="0" w:uiPriority="63" w:semiHidden="0" w:name="Medium Shading 1 Accent 2"/>
     <w:lsdException w:unhideWhenUsed="0" w:uiPriority="64" w:semiHidden="0" w:name="Medium Shading 2 Accent 2"/>
     <w:lsdException w:unhideWhenUsed="0" w:uiPriority="65" w:semiHidden="0" w:name="Medium List 1 Accent 2"/>
-    <w:lsdException w:unhideWhenUsed="0" w:uiPriority="66" w:semiHidden="0" w:name="Medium List 2 Accent 2"/>
+    <w:lsdException w:qFormat="1" w:unhideWhenUsed="0" w:uiPriority="66" w:semiHidden="0" w:name="Medium List 2 Accent 2"/>
     <w:lsdException w:qFormat="1" w:unhideWhenUsed="0" w:uiPriority="67" w:semiHidden="0" w:name="Medium Grid 1 Accent 2"/>
     <w:lsdException w:qFormat="1" w:unhideWhenUsed="0" w:uiPriority="68" w:semiHidden="0" w:name="Medium Grid 2 Accent 2"/>
     <w:lsdException w:qFormat="1" w:unhideWhenUsed="0" w:uiPriority="69" w:semiHidden="0" w:name="Medium Grid 3 Accent 2"/>
@@ -4162,13 +4192,13 @@
     <w:lsdException w:qFormat="1" w:unhideWhenUsed="0" w:uiPriority="68" w:semiHidden="0" w:name="Medium Grid 2 Accent 3"/>
     <w:lsdException w:qFormat="1" w:unhideWhenUsed="0" w:uiPriority="69" w:semiHidden="0" w:name="Medium Grid 3 Accent 3"/>
     <w:lsdException w:qFormat="1" w:unhideWhenUsed="0" w:uiPriority="70" w:semiHidden="0" w:name="Dark List Accent 3"/>
-    <w:lsdException w:unhideWhenUsed="0" w:uiPriority="71" w:semiHidden="0" w:name="Colorful Shading Accent 3"/>
-    <w:lsdException w:unhideWhenUsed="0" w:uiPriority="72" w:semiHidden="0" w:name="Colorful List Accent 3"/>
+    <w:lsdException w:qFormat="1" w:unhideWhenUsed="0" w:uiPriority="71" w:semiHidden="0" w:name="Colorful Shading Accent 3"/>
+    <w:lsdException w:qFormat="1" w:unhideWhenUsed="0" w:uiPriority="72" w:semiHidden="0" w:name="Colorful List Accent 3"/>
     <w:lsdException w:unhideWhenUsed="0" w:uiPriority="73" w:semiHidden="0" w:name="Colorful Grid Accent 3"/>
     <w:lsdException w:unhideWhenUsed="0" w:uiPriority="60" w:semiHidden="0" w:name="Light Shading Accent 4"/>
     <w:lsdException w:qFormat="1" w:unhideWhenUsed="0" w:uiPriority="61" w:semiHidden="0" w:name="Light List Accent 4"/>
     <w:lsdException w:unhideWhenUsed="0" w:uiPriority="62" w:semiHidden="0" w:name="Light Grid Accent 4"/>
-    <w:lsdException w:unhideWhenUsed="0" w:uiPriority="63" w:semiHidden="0" w:name="Medium Shading 1 Accent 4"/>
+    <w:lsdException w:qFormat="1" w:unhideWhenUsed="0" w:uiPriority="63" w:semiHidden="0" w:name="Medium Shading 1 Accent 4"/>
     <w:lsdException w:qFormat="1" w:unhideWhenUsed="0" w:uiPriority="64" w:semiHidden="0" w:name="Medium Shading 2 Accent 4"/>
     <w:lsdException w:qFormat="1" w:unhideWhenUsed="0" w:uiPriority="65" w:semiHidden="0" w:name="Medium List 1 Accent 4"/>
     <w:lsdException w:qFormat="1" w:unhideWhenUsed="0" w:uiPriority="66" w:semiHidden="0" w:name="Medium List 2 Accent 4"/>
@@ -4184,7 +4214,7 @@
     <w:lsdException w:unhideWhenUsed="0" w:uiPriority="62" w:semiHidden="0" w:name="Light Grid Accent 5"/>
     <w:lsdException w:qFormat="1" w:unhideWhenUsed="0" w:uiPriority="63" w:semiHidden="0" w:name="Medium Shading 1 Accent 5"/>
     <w:lsdException w:unhideWhenUsed="0" w:uiPriority="64" w:semiHidden="0" w:name="Medium Shading 2 Accent 5"/>
-    <w:lsdException w:unhideWhenUsed="0" w:uiPriority="65" w:semiHidden="0" w:name="Medium List 1 Accent 5"/>
+    <w:lsdException w:qFormat="1" w:unhideWhenUsed="0" w:uiPriority="65" w:semiHidden="0" w:name="Medium List 1 Accent 5"/>
     <w:lsdException w:unhideWhenUsed="0" w:uiPriority="66" w:semiHidden="0" w:name="Medium List 2 Accent 5"/>
     <w:lsdException w:qFormat="1" w:unhideWhenUsed="0" w:uiPriority="67" w:semiHidden="0" w:name="Medium Grid 1 Accent 5"/>
     <w:lsdException w:unhideWhenUsed="0" w:uiPriority="68" w:semiHidden="0" w:name="Medium Grid 2 Accent 5"/>
@@ -5284,6 +5314,7 @@
   <w:style w:type="table" w:styleId="94">
     <w:name w:val="Table 3D effects 1"/>
     <w:basedOn w:val="12"/>
+    <w:qFormat/>
     <w:uiPriority w:val="0"/>
     <w:pPr>
       <w:widowControl w:val="0"/>
@@ -5805,6 +5836,7 @@
   <w:style w:type="table" w:styleId="100">
     <w:name w:val="Table Classic 4"/>
     <w:basedOn w:val="12"/>
+    <w:qFormat/>
     <w:uiPriority w:val="0"/>
     <w:pPr>
       <w:widowControl w:val="0"/>
@@ -5977,6 +6009,7 @@
   <w:style w:type="table" w:styleId="102">
     <w:name w:val="Table Colorful 2"/>
     <w:basedOn w:val="12"/>
+    <w:qFormat/>
     <w:uiPriority w:val="0"/>
     <w:pPr>
       <w:widowControl w:val="0"/>
@@ -6052,6 +6085,7 @@
   <w:style w:type="table" w:styleId="103">
     <w:name w:val="Table Colorful 3"/>
     <w:basedOn w:val="12"/>
+    <w:qFormat/>
     <w:uiPriority w:val="0"/>
     <w:pPr>
       <w:widowControl w:val="0"/>
@@ -7045,6 +7079,7 @@
   <w:style w:type="table" w:styleId="117">
     <w:name w:val="Table Grid 6"/>
     <w:basedOn w:val="12"/>
+    <w:qFormat/>
     <w:uiPriority w:val="0"/>
     <w:pPr>
       <w:widowControl w:val="0"/>
@@ -10886,6 +10921,7 @@
   <w:style w:type="table" w:styleId="176">
     <w:name w:val="Medium Shading 1 Accent 4"/>
     <w:basedOn w:val="12"/>
+    <w:qFormat/>
     <w:uiPriority w:val="63"/>
     <w:tblPr>
       <w:tblBorders>
@@ -12475,6 +12511,7 @@
   <w:style w:type="table" w:styleId="191">
     <w:name w:val="Medium List 1 Accent 5"/>
     <w:basedOn w:val="12"/>
+    <w:qFormat/>
     <w:uiPriority w:val="65"/>
     <w:rPr>
       <w:color w:val="000000"/>
@@ -12847,6 +12884,7 @@
   <w:style w:type="table" w:styleId="195">
     <w:name w:val="Medium List 2 Accent 2"/>
     <w:basedOn w:val="12"/>
+    <w:qFormat/>
     <w:uiPriority w:val="66"/>
     <w:rPr>
       <w:rFonts w:ascii="SimSun" w:hAnsi="SimSun" w:eastAsia="Courier New" w:cs="Times New Roman"/>
@@ -16600,6 +16638,7 @@
   <w:style w:type="table" w:styleId="231">
     <w:name w:val="Colorful Shading Accent 3"/>
     <w:basedOn w:val="12"/>
+    <w:qFormat/>
     <w:uiPriority w:val="71"/>
     <w:rPr>
       <w:color w:val="000000"/>
@@ -17027,6 +17066,7 @@
   <w:style w:type="table" w:styleId="235">
     <w:name w:val="Colorful List"/>
     <w:basedOn w:val="12"/>
+    <w:qFormat/>
     <w:uiPriority w:val="72"/>
     <w:rPr>
       <w:color w:val="000000"/>
@@ -17252,6 +17292,7 @@
   <w:style w:type="table" w:styleId="238">
     <w:name w:val="Colorful List Accent 3"/>
     <w:basedOn w:val="12"/>
+    <w:qFormat/>
     <w:uiPriority w:val="72"/>
     <w:rPr>
       <w:color w:val="000000"/>
@@ -17552,6 +17593,7 @@
   <w:style w:type="table" w:styleId="242">
     <w:name w:val="Colorful Grid"/>
     <w:basedOn w:val="12"/>
+    <w:qFormat/>
     <w:uiPriority w:val="73"/>
     <w:rPr>
       <w:color w:val="000000"/>

</xml_diff>